<commit_message>
Agregar modelo Transportadora y acuerdos comerciales
</commit_message>
<xml_diff>
--- a/documentos/orden_001.docx
+++ b/documentos/orden_001.docx
@@ -261,6 +261,32 @@
           <w:bCs/>
           <w:lang w:val="es-MX"/>
         </w:rPr>
+        <w:t>Dirección de origen:</w:t>
+      </w:r>
+      <w:r>
+        <w:rPr>
+          <w:lang w:val="es-MX"/>
+        </w:rPr>
+        <w:t xml:space="preserve"> Calle 123 #45-67</w:t>
+      </w:r>
+    </w:p>
+    <w:p>
+      <w:pPr>
+        <w:pStyle w:val="Prrafodelista"/>
+        <w:numPr>
+          <w:ilvl w:val="0"/>
+          <w:numId w:val="2"/>
+        </w:numPr>
+        <w:rPr>
+          <w:lang w:val="es-MX"/>
+        </w:rPr>
+      </w:pPr>
+      <w:r>
+        <w:rPr>
+          <w:b/>
+          <w:bCs/>
+          <w:lang w:val="es-MX"/>
+        </w:rPr>
         <w:t>Ciudad destino:</w:t>
       </w:r>
       <w:r>
@@ -268,6 +294,32 @@
           <w:lang w:val="es-MX"/>
         </w:rPr>
         <w:t xml:space="preserve"> Medellín</w:t>
+      </w:r>
+    </w:p>
+    <w:p>
+      <w:pPr>
+        <w:pStyle w:val="Prrafodelista"/>
+        <w:numPr>
+          <w:ilvl w:val="0"/>
+          <w:numId w:val="2"/>
+        </w:numPr>
+        <w:rPr>
+          <w:lang w:val="es-MX"/>
+        </w:rPr>
+      </w:pPr>
+      <w:r>
+        <w:rPr>
+          <w:b/>
+          <w:bCs/>
+          <w:lang w:val="es-MX"/>
+        </w:rPr>
+        <w:t>Dirección de destino:</w:t>
+      </w:r>
+      <w:r>
+        <w:rPr>
+          <w:lang w:val="es-MX"/>
+        </w:rPr>
+        <w:t xml:space="preserve"> Carrera 89 #12-34</w:t>
       </w:r>
     </w:p>
     <w:p>

</xml_diff>

<commit_message>
Implementar selección de transportadora con restricción de tiempo y costos COP
</commit_message>
<xml_diff>
--- a/documentos/orden_001.docx
+++ b/documentos/orden_001.docx
@@ -397,7 +397,13 @@
         <w:rPr>
           <w:lang w:val="es-MX"/>
         </w:rPr>
-        <w:t xml:space="preserve"> 15</w:t>
+        <w:t xml:space="preserve"> </w:t>
+      </w:r>
+      <w:r>
+        <w:rPr>
+          <w:lang w:val="es-MX"/>
+        </w:rPr>
+        <w:t>3</w:t>
       </w:r>
     </w:p>
     <w:p>

</xml_diff>